<commit_message>
feat(informe): adicion de codigo de ultima version del informe | feat(IPTrecursos): creacion de funcion de monitoreo de progreso en recursos IPT | feat(metages_typos): creacion de visualizacion de tablas autoreferenciadas complejas | fix(galah): actualizaci'on de extraccion de datos desde proyecto de paquete en desarrollo
</commit_message>
<xml_diff>
--- a/inst/reports/assets/portada/tablas_versiones.docx
+++ b/inst/reports/assets/portada/tablas_versiones.docx
@@ -2,24 +2,61 @@
 <file path=word/document.xml><?xml version="1.0" encoding="utf-8"?>
 <w:document xmlns:wpc="http://schemas.microsoft.com/office/word/2010/wordprocessingCanvas" xmlns:cx="http://schemas.microsoft.com/office/drawing/2014/chartex" xmlns:cx1="http://schemas.microsoft.com/office/drawing/2015/9/8/chartex" xmlns:cx2="http://schemas.microsoft.com/office/drawing/2015/10/21/chartex" xmlns:cx3="http://schemas.microsoft.com/office/drawing/2016/5/9/chartex" xmlns:cx4="http://schemas.microsoft.com/office/drawing/2016/5/10/chartex" xmlns:cx5="http://schemas.microsoft.com/office/drawing/2016/5/11/chartex" xmlns:cx6="http://schemas.microsoft.com/office/drawing/2016/5/12/chartex" xmlns:cx7="http://schemas.microsoft.com/office/drawing/2016/5/13/chartex" xmlns:cx8="http://schemas.microsoft.com/office/drawing/2016/5/14/chartex" xmlns:mc="http://schemas.openxmlformats.org/markup-compatibility/2006" xmlns:aink="http://schemas.microsoft.com/office/drawing/2016/ink" xmlns:am3d="http://schemas.microsoft.com/office/drawing/2017/model3d" xmlns:o="urn:schemas-microsoft-com:office:office" xmlns:oel="http://schemas.microsoft.com/office/2019/extlst" xmlns:r="http://schemas.openxmlformats.org/officeDocument/2006/relationships" xmlns:m="http://schemas.openxmlformats.org/officeDocument/2006/math" xmlns:v="urn:schemas-microsoft-com:vml" xmlns:wp14="http://schemas.microsoft.com/office/word/2010/wordprocessingDrawing" xmlns:wp="http://schemas.openxmlformats.org/drawingml/2006/wordprocessingDrawing" xmlns:w10="urn:schemas-microsoft-com:office:word" xmlns:w="http://schemas.openxmlformats.org/wordprocessingml/2006/main" xmlns:w14="http://schemas.microsoft.com/office/word/2010/wordml" xmlns:w15="http://schemas.microsoft.com/office/word/2012/wordml" xmlns:w16cex="http://schemas.microsoft.com/office/word/2018/wordml/cex" xmlns:w16cid="http://schemas.microsoft.com/office/word/2016/wordml/cid" xmlns:w16="http://schemas.microsoft.com/office/word/2018/wordml" xmlns:w16sdtdh="http://schemas.microsoft.com/office/word/2020/wordml/sdtdatahash" xmlns:w16se="http://schemas.microsoft.com/office/word/2015/wordml/symex" xmlns:wpg="http://schemas.microsoft.com/office/word/2010/wordprocessingGroup" xmlns:wpi="http://schemas.microsoft.com/office/word/2010/wordprocessingInk" xmlns:wne="http://schemas.microsoft.com/office/word/2006/wordml" xmlns:wps="http://schemas.microsoft.com/office/word/2010/wordprocessingShape" mc:Ignorable="w14 w15 w16se w16cid w16 w16cex w16sdtdh wp14">
   <w:body>
+    <w:p/>
+    <w:p/>
+    <w:p/>
+    <w:p/>
+    <w:p/>
+    <w:p/>
+    <w:p/>
+    <w:p/>
+    <w:p/>
+    <w:p/>
+    <w:p/>
+    <w:p/>
+    <w:p/>
+    <w:p/>
+    <w:p/>
+    <w:p/>
+    <w:p/>
+    <w:p/>
+    <w:p/>
+    <w:p/>
+    <w:p/>
+    <w:p/>
+    <w:p/>
+    <w:p/>
+    <w:p/>
+    <w:p/>
+    <w:p/>
+    <w:p/>
+    <w:p/>
+    <w:p/>
     <w:tbl>
       <w:tblPr>
-        <w:tblStyle w:val="Tablaconcuadrcula"/>
-        <w:tblW w:w="10065" w:type="dxa"/>
-        <w:tblInd w:w="-431" w:type="dxa"/>
+        <w:tblStyle w:val="Tablanormal1"/>
+        <w:tblW w:w="9918" w:type="dxa"/>
         <w:tblLook w:val="04A0" w:firstRow="1" w:lastRow="0" w:firstColumn="1" w:lastColumn="0" w:noHBand="0" w:noVBand="1"/>
       </w:tblPr>
       <w:tblGrid>
-        <w:gridCol w:w="990"/>
-        <w:gridCol w:w="1704"/>
-        <w:gridCol w:w="7371"/>
+        <w:gridCol w:w="1038"/>
+        <w:gridCol w:w="1702"/>
+        <w:gridCol w:w="7178"/>
       </w:tblGrid>
       <w:tr>
-        <w:tc>
-          <w:tcPr>
-            <w:tcW w:w="990" w:type="dxa"/>
-          </w:tcPr>
-          <w:p>
+        <w:trPr>
+          <w:cnfStyle w:val="100000000000" w:firstRow="1" w:lastRow="0" w:firstColumn="0" w:lastColumn="0" w:oddVBand="0" w:evenVBand="0" w:oddHBand="0" w:evenHBand="0" w:firstRowFirstColumn="0" w:firstRowLastColumn="0" w:lastRowFirstColumn="0" w:lastRowLastColumn="0"/>
+        </w:trPr>
+        <w:tc>
+          <w:tcPr>
+            <w:cnfStyle w:val="001000000000" w:firstRow="0" w:lastRow="0" w:firstColumn="1" w:lastColumn="0" w:oddVBand="0" w:evenVBand="0" w:oddHBand="0" w:evenHBand="0" w:firstRowFirstColumn="0" w:firstRowLastColumn="0" w:lastRowFirstColumn="0" w:lastRowLastColumn="0"/>
+            <w:tcW w:w="1038" w:type="dxa"/>
+            <w:vAlign w:val="center"/>
+          </w:tcPr>
+          <w:p>
+            <w:pPr>
+              <w:jc w:val="center"/>
+            </w:pPr>
             <w:r>
               <w:t>Versión</w:t>
             </w:r>
@@ -27,9 +64,14 @@
         </w:tc>
         <w:tc>
           <w:tcPr>
-            <w:tcW w:w="1704" w:type="dxa"/>
-          </w:tcPr>
-          <w:p>
+            <w:tcW w:w="1702" w:type="dxa"/>
+            <w:vAlign w:val="center"/>
+          </w:tcPr>
+          <w:p>
+            <w:pPr>
+              <w:jc w:val="center"/>
+              <w:cnfStyle w:val="100000000000" w:firstRow="1" w:lastRow="0" w:firstColumn="0" w:lastColumn="0" w:oddVBand="0" w:evenVBand="0" w:oddHBand="0" w:evenHBand="0" w:firstRowFirstColumn="0" w:firstRowLastColumn="0" w:lastRowFirstColumn="0" w:lastRowLastColumn="0"/>
+            </w:pPr>
             <w:r>
               <w:t>Fecha</w:t>
             </w:r>
@@ -37,9 +79,14 @@
         </w:tc>
         <w:tc>
           <w:tcPr>
-            <w:tcW w:w="7371" w:type="dxa"/>
-          </w:tcPr>
-          <w:p>
+            <w:tcW w:w="7178" w:type="dxa"/>
+            <w:vAlign w:val="center"/>
+          </w:tcPr>
+          <w:p>
+            <w:pPr>
+              <w:jc w:val="center"/>
+              <w:cnfStyle w:val="100000000000" w:firstRow="1" w:lastRow="0" w:firstColumn="0" w:lastColumn="0" w:oddVBand="0" w:evenVBand="0" w:oddHBand="0" w:evenHBand="0" w:firstRowFirstColumn="0" w:firstRowLastColumn="0" w:lastRowFirstColumn="0" w:lastRowLastColumn="0"/>
+            </w:pPr>
             <w:r>
               <w:t>Notas</w:t>
             </w:r>
@@ -47,9 +94,14 @@
         </w:tc>
       </w:tr>
       <w:tr>
-        <w:tc>
-          <w:tcPr>
-            <w:tcW w:w="990" w:type="dxa"/>
+        <w:trPr>
+          <w:cnfStyle w:val="000000100000" w:firstRow="0" w:lastRow="0" w:firstColumn="0" w:lastColumn="0" w:oddVBand="0" w:evenVBand="0" w:oddHBand="1" w:evenHBand="0" w:firstRowFirstColumn="0" w:firstRowLastColumn="0" w:lastRowFirstColumn="0" w:lastRowLastColumn="0"/>
+        </w:trPr>
+        <w:tc>
+          <w:tcPr>
+            <w:cnfStyle w:val="001000000000" w:firstRow="0" w:lastRow="0" w:firstColumn="1" w:lastColumn="0" w:oddVBand="0" w:evenVBand="0" w:oddHBand="0" w:evenHBand="0" w:firstRowFirstColumn="0" w:firstRowLastColumn="0" w:lastRowFirstColumn="0" w:lastRowLastColumn="0"/>
+            <w:tcW w:w="1038" w:type="dxa"/>
+            <w:vAlign w:val="center"/>
           </w:tcPr>
           <w:p>
             <w:r>
@@ -59,9 +111,13 @@
         </w:tc>
         <w:tc>
           <w:tcPr>
-            <w:tcW w:w="1704" w:type="dxa"/>
-          </w:tcPr>
-          <w:p>
+            <w:tcW w:w="1702" w:type="dxa"/>
+            <w:vAlign w:val="center"/>
+          </w:tcPr>
+          <w:p>
+            <w:pPr>
+              <w:cnfStyle w:val="000000100000" w:firstRow="0" w:lastRow="0" w:firstColumn="0" w:lastColumn="0" w:oddVBand="0" w:evenVBand="0" w:oddHBand="1" w:evenHBand="0" w:firstRowFirstColumn="0" w:firstRowLastColumn="0" w:lastRowFirstColumn="0" w:lastRowLastColumn="0"/>
+            </w:pPr>
             <w:r>
               <w:t>Marzo 2026</w:t>
             </w:r>
@@ -69,17 +125,30 @@
         </w:tc>
         <w:tc>
           <w:tcPr>
-            <w:tcW w:w="7371" w:type="dxa"/>
+            <w:tcW w:w="7178" w:type="dxa"/>
+            <w:vAlign w:val="center"/>
           </w:tcPr>
           <w:p>
             <w:pPr>
               <w:spacing w:after="180"/>
-            </w:pPr>
-            <w:r>
-              <w:t xml:space="preserve">Compilado y editado por Rubén Pérez </w:t>
+              <w:cnfStyle w:val="000000100000" w:firstRow="0" w:lastRow="0" w:firstColumn="0" w:lastColumn="0" w:oddVBand="0" w:evenVBand="0" w:oddHBand="1" w:evenHBand="0" w:firstRowFirstColumn="0" w:firstRowLastColumn="0" w:lastRowFirstColumn="0" w:lastRowLastColumn="0"/>
+            </w:pPr>
+            <w:r>
+              <w:t xml:space="preserve">Compilado y editado por </w:t>
+            </w:r>
+            <w:r>
+              <w:rPr>
+                <w:b/>
+                <w:bCs/>
+              </w:rPr>
+              <w:t xml:space="preserve">Rubén Pérez </w:t>
             </w:r>
             <w:proofErr w:type="spellStart"/>
             <w:r>
+              <w:rPr>
+                <w:b/>
+                <w:bCs/>
+              </w:rPr>
               <w:t>Pérez</w:t>
             </w:r>
             <w:proofErr w:type="spellEnd"/>
@@ -90,6 +159,7 @@
           <w:p>
             <w:pPr>
               <w:spacing w:after="180"/>
+              <w:cnfStyle w:val="000000100000" w:firstRow="0" w:lastRow="0" w:firstColumn="0" w:lastColumn="0" w:oddVBand="0" w:evenVBand="0" w:oddHBand="1" w:evenHBand="0" w:firstRowFirstColumn="0" w:firstRowLastColumn="0" w:lastRowFirstColumn="0" w:lastRowLastColumn="0"/>
             </w:pPr>
             <w:r>
               <w:t xml:space="preserve">Colaboraron en esta edición Katia </w:t>
@@ -108,7 +178,9 @@
       <w:tr>
         <w:tc>
           <w:tcPr>
-            <w:tcW w:w="990" w:type="dxa"/>
+            <w:cnfStyle w:val="001000000000" w:firstRow="0" w:lastRow="0" w:firstColumn="1" w:lastColumn="0" w:oddVBand="0" w:evenVBand="0" w:oddHBand="0" w:evenHBand="0" w:firstRowFirstColumn="0" w:firstRowLastColumn="0" w:lastRowFirstColumn="0" w:lastRowLastColumn="0"/>
+            <w:tcW w:w="1038" w:type="dxa"/>
+            <w:vAlign w:val="center"/>
           </w:tcPr>
           <w:p>
             <w:r>
@@ -118,9 +190,13 @@
         </w:tc>
         <w:tc>
           <w:tcPr>
-            <w:tcW w:w="1704" w:type="dxa"/>
-          </w:tcPr>
-          <w:p>
+            <w:tcW w:w="1702" w:type="dxa"/>
+            <w:vAlign w:val="center"/>
+          </w:tcPr>
+          <w:p>
+            <w:pPr>
+              <w:cnfStyle w:val="000000000000" w:firstRow="0" w:lastRow="0" w:firstColumn="0" w:lastColumn="0" w:oddVBand="0" w:evenVBand="0" w:oddHBand="0" w:evenHBand="0" w:firstRowFirstColumn="0" w:firstRowLastColumn="0" w:lastRowFirstColumn="0" w:lastRowLastColumn="0"/>
+            </w:pPr>
             <w:r>
               <w:t>Octubre 2021</w:t>
             </w:r>
@@ -128,11 +204,13 @@
         </w:tc>
         <w:tc>
           <w:tcPr>
-            <w:tcW w:w="7371" w:type="dxa"/>
+            <w:tcW w:w="7178" w:type="dxa"/>
+            <w:vAlign w:val="center"/>
           </w:tcPr>
           <w:p>
             <w:pPr>
               <w:spacing w:after="180"/>
+              <w:cnfStyle w:val="000000000000" w:firstRow="0" w:lastRow="0" w:firstColumn="0" w:lastColumn="0" w:oddVBand="0" w:evenVBand="0" w:oddHBand="0" w:evenHBand="0" w:firstRowFirstColumn="0" w:firstRowLastColumn="0" w:lastRowFirstColumn="0" w:lastRowLastColumn="0"/>
             </w:pPr>
             <w:r>
               <w:t xml:space="preserve">Colaboraron en esta edición Felipe Castilla, Katia </w:t>
@@ -149,9 +227,14 @@
         </w:tc>
       </w:tr>
       <w:tr>
-        <w:tc>
-          <w:tcPr>
-            <w:tcW w:w="990" w:type="dxa"/>
+        <w:trPr>
+          <w:cnfStyle w:val="000000100000" w:firstRow="0" w:lastRow="0" w:firstColumn="0" w:lastColumn="0" w:oddVBand="0" w:evenVBand="0" w:oddHBand="1" w:evenHBand="0" w:firstRowFirstColumn="0" w:firstRowLastColumn="0" w:lastRowFirstColumn="0" w:lastRowLastColumn="0"/>
+        </w:trPr>
+        <w:tc>
+          <w:tcPr>
+            <w:cnfStyle w:val="001000000000" w:firstRow="0" w:lastRow="0" w:firstColumn="1" w:lastColumn="0" w:oddVBand="0" w:evenVBand="0" w:oddHBand="0" w:evenHBand="0" w:firstRowFirstColumn="0" w:firstRowLastColumn="0" w:lastRowFirstColumn="0" w:lastRowLastColumn="0"/>
+            <w:tcW w:w="1038" w:type="dxa"/>
+            <w:vAlign w:val="center"/>
           </w:tcPr>
           <w:p>
             <w:r>
@@ -161,9 +244,13 @@
         </w:tc>
         <w:tc>
           <w:tcPr>
-            <w:tcW w:w="1704" w:type="dxa"/>
-          </w:tcPr>
-          <w:p>
+            <w:tcW w:w="1702" w:type="dxa"/>
+            <w:vAlign w:val="center"/>
+          </w:tcPr>
+          <w:p>
+            <w:pPr>
+              <w:cnfStyle w:val="000000100000" w:firstRow="0" w:lastRow="0" w:firstColumn="0" w:lastColumn="0" w:oddVBand="0" w:evenVBand="0" w:oddHBand="1" w:evenHBand="0" w:firstRowFirstColumn="0" w:firstRowLastColumn="0" w:lastRowFirstColumn="0" w:lastRowLastColumn="0"/>
+            </w:pPr>
             <w:r>
               <w:t>Abril 2015</w:t>
             </w:r>
@@ -171,11 +258,13 @@
         </w:tc>
         <w:tc>
           <w:tcPr>
-            <w:tcW w:w="7371" w:type="dxa"/>
+            <w:tcW w:w="7178" w:type="dxa"/>
+            <w:vAlign w:val="center"/>
           </w:tcPr>
           <w:p>
             <w:pPr>
               <w:spacing w:after="180"/>
+              <w:cnfStyle w:val="000000100000" w:firstRow="0" w:lastRow="0" w:firstColumn="0" w:lastColumn="0" w:oddVBand="0" w:evenVBand="0" w:oddHBand="1" w:evenHBand="0" w:firstRowFirstColumn="0" w:firstRowLastColumn="0" w:lastRowFirstColumn="0" w:lastRowLastColumn="0"/>
             </w:pPr>
             <w:r>
               <w:t xml:space="preserve">Compilado y editado por Pablo Muñoz Rodríguez, Felipe Castilla </w:t>
@@ -192,9 +281,20 @@
           <w:p>
             <w:pPr>
               <w:spacing w:after="180"/>
-            </w:pPr>
-            <w:r>
-              <w:t>Comentarios y supervisión por Francisco Pando.</w:t>
+              <w:cnfStyle w:val="000000100000" w:firstRow="0" w:lastRow="0" w:firstColumn="0" w:lastColumn="0" w:oddVBand="0" w:evenVBand="0" w:oddHBand="1" w:evenHBand="0" w:firstRowFirstColumn="0" w:firstRowLastColumn="0" w:lastRowFirstColumn="0" w:lastRowLastColumn="0"/>
+            </w:pPr>
+            <w:r>
+              <w:t xml:space="preserve">Comentarios y supervisión por </w:t>
+            </w:r>
+            <w:r>
+              <w:rPr>
+                <w:b/>
+                <w:bCs/>
+              </w:rPr>
+              <w:t>Francisco Pando</w:t>
+            </w:r>
+            <w:r>
+              <w:t>.</w:t>
             </w:r>
           </w:p>
         </w:tc>
@@ -202,7 +302,9 @@
       <w:tr>
         <w:tc>
           <w:tcPr>
-            <w:tcW w:w="990" w:type="dxa"/>
+            <w:cnfStyle w:val="001000000000" w:firstRow="0" w:lastRow="0" w:firstColumn="1" w:lastColumn="0" w:oddVBand="0" w:evenVBand="0" w:oddHBand="0" w:evenHBand="0" w:firstRowFirstColumn="0" w:firstRowLastColumn="0" w:lastRowFirstColumn="0" w:lastRowLastColumn="0"/>
+            <w:tcW w:w="1038" w:type="dxa"/>
+            <w:vAlign w:val="center"/>
           </w:tcPr>
           <w:p>
             <w:r>
@@ -212,9 +314,13 @@
         </w:tc>
         <w:tc>
           <w:tcPr>
-            <w:tcW w:w="1704" w:type="dxa"/>
-          </w:tcPr>
-          <w:p>
+            <w:tcW w:w="1702" w:type="dxa"/>
+            <w:vAlign w:val="center"/>
+          </w:tcPr>
+          <w:p>
+            <w:pPr>
+              <w:cnfStyle w:val="000000000000" w:firstRow="0" w:lastRow="0" w:firstColumn="0" w:lastColumn="0" w:oddVBand="0" w:evenVBand="0" w:oddHBand="0" w:evenHBand="0" w:firstRowFirstColumn="0" w:firstRowLastColumn="0" w:lastRowFirstColumn="0" w:lastRowLastColumn="0"/>
+            </w:pPr>
             <w:r>
               <w:t>Septiembre 2012</w:t>
             </w:r>
@@ -222,30 +328,58 @@
         </w:tc>
         <w:tc>
           <w:tcPr>
-            <w:tcW w:w="7371" w:type="dxa"/>
+            <w:tcW w:w="7178" w:type="dxa"/>
+            <w:vAlign w:val="center"/>
           </w:tcPr>
           <w:p>
             <w:pPr>
               <w:spacing w:after="180"/>
-            </w:pPr>
-            <w:r>
-              <w:t>Compilado y editado por Virginia González.</w:t>
+              <w:cnfStyle w:val="000000000000" w:firstRow="0" w:lastRow="0" w:firstColumn="0" w:lastColumn="0" w:oddVBand="0" w:evenVBand="0" w:oddHBand="0" w:evenHBand="0" w:firstRowFirstColumn="0" w:firstRowLastColumn="0" w:lastRowFirstColumn="0" w:lastRowLastColumn="0"/>
+            </w:pPr>
+            <w:r>
+              <w:t xml:space="preserve">Compilado y editado por </w:t>
+            </w:r>
+            <w:r>
+              <w:rPr>
+                <w:b/>
+                <w:bCs/>
+              </w:rPr>
+              <w:t>Virginia González</w:t>
+            </w:r>
+            <w:r>
+              <w:t>.</w:t>
             </w:r>
           </w:p>
           <w:p>
             <w:pPr>
               <w:spacing w:after="180"/>
-            </w:pPr>
-            <w:r>
-              <w:t>Comentarios y supervisión por Francisco Pando.</w:t>
+              <w:cnfStyle w:val="000000000000" w:firstRow="0" w:lastRow="0" w:firstColumn="0" w:lastColumn="0" w:oddVBand="0" w:evenVBand="0" w:oddHBand="0" w:evenHBand="0" w:firstRowFirstColumn="0" w:firstRowLastColumn="0" w:lastRowFirstColumn="0" w:lastRowLastColumn="0"/>
+            </w:pPr>
+            <w:r>
+              <w:t xml:space="preserve">Comentarios y supervisión por </w:t>
+            </w:r>
+            <w:r>
+              <w:rPr>
+                <w:b/>
+                <w:bCs/>
+              </w:rPr>
+              <w:t>Francisco Pando</w:t>
+            </w:r>
+            <w:r>
+              <w:t>.</w:t>
             </w:r>
           </w:p>
         </w:tc>
       </w:tr>
       <w:tr>
-        <w:tc>
-          <w:tcPr>
-            <w:tcW w:w="990" w:type="dxa"/>
+        <w:trPr>
+          <w:cnfStyle w:val="000000100000" w:firstRow="0" w:lastRow="0" w:firstColumn="0" w:lastColumn="0" w:oddVBand="0" w:evenVBand="0" w:oddHBand="1" w:evenHBand="0" w:firstRowFirstColumn="0" w:firstRowLastColumn="0" w:lastRowFirstColumn="0" w:lastRowLastColumn="0"/>
+        </w:trPr>
+        <w:tc>
+          <w:tcPr>
+            <w:cnfStyle w:val="001000000000" w:firstRow="0" w:lastRow="0" w:firstColumn="1" w:lastColumn="0" w:oddVBand="0" w:evenVBand="0" w:oddHBand="0" w:evenHBand="0" w:firstRowFirstColumn="0" w:firstRowLastColumn="0" w:lastRowFirstColumn="0" w:lastRowLastColumn="0"/>
+            <w:tcW w:w="1038" w:type="dxa"/>
+            <w:vAlign w:val="center"/>
           </w:tcPr>
           <w:p>
             <w:r>
@@ -255,9 +389,13 @@
         </w:tc>
         <w:tc>
           <w:tcPr>
-            <w:tcW w:w="1704" w:type="dxa"/>
-          </w:tcPr>
-          <w:p>
+            <w:tcW w:w="1702" w:type="dxa"/>
+            <w:vAlign w:val="center"/>
+          </w:tcPr>
+          <w:p>
+            <w:pPr>
+              <w:cnfStyle w:val="000000100000" w:firstRow="0" w:lastRow="0" w:firstColumn="0" w:lastColumn="0" w:oddVBand="0" w:evenVBand="0" w:oddHBand="1" w:evenHBand="0" w:firstRowFirstColumn="0" w:firstRowLastColumn="0" w:lastRowFirstColumn="0" w:lastRowLastColumn="0"/>
+            </w:pPr>
             <w:r>
               <w:t>Febrero 2010</w:t>
             </w:r>
@@ -265,11 +403,13 @@
         </w:tc>
         <w:tc>
           <w:tcPr>
-            <w:tcW w:w="7371" w:type="dxa"/>
+            <w:tcW w:w="7178" w:type="dxa"/>
+            <w:vAlign w:val="center"/>
           </w:tcPr>
           <w:p>
             <w:pPr>
               <w:spacing w:after="180"/>
+              <w:cnfStyle w:val="000000100000" w:firstRow="0" w:lastRow="0" w:firstColumn="0" w:lastColumn="0" w:oddVBand="0" w:evenVBand="0" w:oddHBand="1" w:evenHBand="0" w:firstRowFirstColumn="0" w:firstRowLastColumn="0" w:lastRowFirstColumn="0" w:lastRowLastColumn="0"/>
             </w:pPr>
             <w:r>
               <w:t>Compilado y editado por María A. Encinas y Cristina Villaverde.</w:t>
@@ -278,9 +418,20 @@
           <w:p>
             <w:pPr>
               <w:spacing w:after="180"/>
-            </w:pPr>
-            <w:r>
-              <w:t>Comentarios y supervisión por Francisco Pando.</w:t>
+              <w:cnfStyle w:val="000000100000" w:firstRow="0" w:lastRow="0" w:firstColumn="0" w:lastColumn="0" w:oddVBand="0" w:evenVBand="0" w:oddHBand="1" w:evenHBand="0" w:firstRowFirstColumn="0" w:firstRowLastColumn="0" w:lastRowFirstColumn="0" w:lastRowLastColumn="0"/>
+            </w:pPr>
+            <w:r>
+              <w:t xml:space="preserve">Comentarios y supervisión por </w:t>
+            </w:r>
+            <w:r>
+              <w:rPr>
+                <w:b/>
+                <w:bCs/>
+              </w:rPr>
+              <w:t>Francisco Pando</w:t>
+            </w:r>
+            <w:r>
+              <w:t>.</w:t>
             </w:r>
           </w:p>
         </w:tc>
@@ -288,7 +439,9 @@
       <w:tr>
         <w:tc>
           <w:tcPr>
-            <w:tcW w:w="990" w:type="dxa"/>
+            <w:cnfStyle w:val="001000000000" w:firstRow="0" w:lastRow="0" w:firstColumn="1" w:lastColumn="0" w:oddVBand="0" w:evenVBand="0" w:oddHBand="0" w:evenHBand="0" w:firstRowFirstColumn="0" w:firstRowLastColumn="0" w:lastRowFirstColumn="0" w:lastRowLastColumn="0"/>
+            <w:tcW w:w="1038" w:type="dxa"/>
+            <w:vAlign w:val="center"/>
           </w:tcPr>
           <w:p>
             <w:r>
@@ -298,9 +451,13 @@
         </w:tc>
         <w:tc>
           <w:tcPr>
-            <w:tcW w:w="1704" w:type="dxa"/>
-          </w:tcPr>
-          <w:p>
+            <w:tcW w:w="1702" w:type="dxa"/>
+            <w:vAlign w:val="center"/>
+          </w:tcPr>
+          <w:p>
+            <w:pPr>
+              <w:cnfStyle w:val="000000000000" w:firstRow="0" w:lastRow="0" w:firstColumn="0" w:lastColumn="0" w:oddVBand="0" w:evenVBand="0" w:oddHBand="0" w:evenHBand="0" w:firstRowFirstColumn="0" w:firstRowLastColumn="0" w:lastRowFirstColumn="0" w:lastRowLastColumn="0"/>
+            </w:pPr>
             <w:r>
               <w:t>Febrero 2009</w:t>
             </w:r>
@@ -308,11 +465,13 @@
         </w:tc>
         <w:tc>
           <w:tcPr>
-            <w:tcW w:w="7371" w:type="dxa"/>
+            <w:tcW w:w="7178" w:type="dxa"/>
+            <w:vAlign w:val="center"/>
           </w:tcPr>
           <w:p>
             <w:pPr>
               <w:spacing w:after="180"/>
+              <w:cnfStyle w:val="000000000000" w:firstRow="0" w:lastRow="0" w:firstColumn="0" w:lastColumn="0" w:oddVBand="0" w:evenVBand="0" w:oddHBand="0" w:evenHBand="0" w:firstRowFirstColumn="0" w:firstRowLastColumn="0" w:lastRowFirstColumn="0" w:lastRowLastColumn="0"/>
             </w:pPr>
             <w:r>
               <w:t>Compilado y editado por María A. Encinas y Cristina Villaverde.</w:t>
@@ -321,17 +480,33 @@
           <w:p>
             <w:pPr>
               <w:spacing w:after="180"/>
-            </w:pPr>
-            <w:r>
-              <w:t>Comentarios y supervisión por Francisco Pando.</w:t>
+              <w:cnfStyle w:val="000000000000" w:firstRow="0" w:lastRow="0" w:firstColumn="0" w:lastColumn="0" w:oddVBand="0" w:evenVBand="0" w:oddHBand="0" w:evenHBand="0" w:firstRowFirstColumn="0" w:firstRowLastColumn="0" w:lastRowFirstColumn="0" w:lastRowLastColumn="0"/>
+            </w:pPr>
+            <w:r>
+              <w:t xml:space="preserve">Comentarios y supervisión por </w:t>
+            </w:r>
+            <w:r>
+              <w:rPr>
+                <w:b/>
+                <w:bCs/>
+              </w:rPr>
+              <w:t>Francisco Pando</w:t>
+            </w:r>
+            <w:r>
+              <w:t>.</w:t>
             </w:r>
           </w:p>
         </w:tc>
       </w:tr>
       <w:tr>
-        <w:tc>
-          <w:tcPr>
-            <w:tcW w:w="990" w:type="dxa"/>
+        <w:trPr>
+          <w:cnfStyle w:val="000000100000" w:firstRow="0" w:lastRow="0" w:firstColumn="0" w:lastColumn="0" w:oddVBand="0" w:evenVBand="0" w:oddHBand="1" w:evenHBand="0" w:firstRowFirstColumn="0" w:firstRowLastColumn="0" w:lastRowFirstColumn="0" w:lastRowLastColumn="0"/>
+        </w:trPr>
+        <w:tc>
+          <w:tcPr>
+            <w:cnfStyle w:val="001000000000" w:firstRow="0" w:lastRow="0" w:firstColumn="1" w:lastColumn="0" w:oddVBand="0" w:evenVBand="0" w:oddHBand="0" w:evenHBand="0" w:firstRowFirstColumn="0" w:firstRowLastColumn="0" w:lastRowFirstColumn="0" w:lastRowLastColumn="0"/>
+            <w:tcW w:w="1038" w:type="dxa"/>
+            <w:vAlign w:val="center"/>
           </w:tcPr>
           <w:p>
             <w:r>
@@ -341,9 +516,13 @@
         </w:tc>
         <w:tc>
           <w:tcPr>
-            <w:tcW w:w="1704" w:type="dxa"/>
-          </w:tcPr>
-          <w:p>
+            <w:tcW w:w="1702" w:type="dxa"/>
+            <w:vAlign w:val="center"/>
+          </w:tcPr>
+          <w:p>
+            <w:pPr>
+              <w:cnfStyle w:val="000000100000" w:firstRow="0" w:lastRow="0" w:firstColumn="0" w:lastColumn="0" w:oddVBand="0" w:evenVBand="0" w:oddHBand="1" w:evenHBand="0" w:firstRowFirstColumn="0" w:firstRowLastColumn="0" w:lastRowFirstColumn="0" w:lastRowLastColumn="0"/>
+            </w:pPr>
             <w:r>
               <w:t>Enero 2005</w:t>
             </w:r>
@@ -351,14 +530,26 @@
         </w:tc>
         <w:tc>
           <w:tcPr>
-            <w:tcW w:w="7371" w:type="dxa"/>
+            <w:tcW w:w="7178" w:type="dxa"/>
+            <w:vAlign w:val="center"/>
           </w:tcPr>
           <w:p>
             <w:pPr>
               <w:spacing w:after="180"/>
-            </w:pPr>
-            <w:r>
-              <w:t xml:space="preserve">Basado considerablemente en el trabajo de Mercedes París, en el ámbito del proyecto europeo </w:t>
+              <w:cnfStyle w:val="000000100000" w:firstRow="0" w:lastRow="0" w:firstColumn="0" w:lastColumn="0" w:oddVBand="0" w:evenVBand="0" w:oddHBand="1" w:evenHBand="0" w:firstRowFirstColumn="0" w:firstRowLastColumn="0" w:lastRowFirstColumn="0" w:lastRowLastColumn="0"/>
+            </w:pPr>
+            <w:r>
+              <w:t xml:space="preserve">Basado considerablemente en el trabajo de </w:t>
+            </w:r>
+            <w:r>
+              <w:rPr>
+                <w:b/>
+                <w:bCs/>
+              </w:rPr>
+              <w:t>Mercedes París</w:t>
+            </w:r>
+            <w:r>
+              <w:t xml:space="preserve">, en el ámbito del proyecto europeo </w:t>
             </w:r>
             <w:proofErr w:type="spellStart"/>
             <w:r>
@@ -372,17 +563,39 @@
           <w:p>
             <w:pPr>
               <w:spacing w:after="180"/>
-            </w:pPr>
-            <w:r>
-              <w:t>Compilado y editado por Alberto González Talaván.</w:t>
+              <w:cnfStyle w:val="000000100000" w:firstRow="0" w:lastRow="0" w:firstColumn="0" w:lastColumn="0" w:oddVBand="0" w:evenVBand="0" w:oddHBand="1" w:evenHBand="0" w:firstRowFirstColumn="0" w:firstRowLastColumn="0" w:lastRowFirstColumn="0" w:lastRowLastColumn="0"/>
+            </w:pPr>
+            <w:r>
+              <w:t xml:space="preserve">Compilado y editado por </w:t>
+            </w:r>
+            <w:r>
+              <w:rPr>
+                <w:b/>
+                <w:bCs/>
+              </w:rPr>
+              <w:t>Alberto González Talaván</w:t>
+            </w:r>
+            <w:r>
+              <w:t>.</w:t>
             </w:r>
           </w:p>
           <w:p>
             <w:pPr>
               <w:spacing w:after="180"/>
-            </w:pPr>
-            <w:r>
-              <w:t>Comentarios y supervisión por Francisco Pando.</w:t>
+              <w:cnfStyle w:val="000000100000" w:firstRow="0" w:lastRow="0" w:firstColumn="0" w:lastColumn="0" w:oddVBand="0" w:evenVBand="0" w:oddHBand="1" w:evenHBand="0" w:firstRowFirstColumn="0" w:firstRowLastColumn="0" w:lastRowFirstColumn="0" w:lastRowLastColumn="0"/>
+            </w:pPr>
+            <w:r>
+              <w:t xml:space="preserve">Comentarios y supervisión por </w:t>
+            </w:r>
+            <w:r>
+              <w:rPr>
+                <w:b/>
+                <w:bCs/>
+              </w:rPr>
+              <w:t>Francisco Pando</w:t>
+            </w:r>
+            <w:r>
+              <w:t>.</w:t>
             </w:r>
           </w:p>
         </w:tc>
@@ -391,13 +604,78 @@
     <w:p/>
     <w:p/>
     <w:sectPr>
+      <w:headerReference w:type="default" r:id="rId6"/>
       <w:pgSz w:w="11906" w:h="16838"/>
-      <w:pgMar w:top="1440" w:right="1440" w:bottom="1440" w:left="1440" w:header="708" w:footer="708" w:gutter="0"/>
+      <w:pgMar w:top="1440" w:right="991" w:bottom="1440" w:left="1134" w:header="708" w:footer="708" w:gutter="0"/>
       <w:cols w:space="708"/>
       <w:docGrid w:linePitch="360"/>
     </w:sectPr>
   </w:body>
 </w:document>
+</file>
+
+<file path=word/endnotes.xml><?xml version="1.0" encoding="utf-8"?>
+<w:endnotes xmlns:wpc="http://schemas.microsoft.com/office/word/2010/wordprocessingCanvas" xmlns:cx="http://schemas.microsoft.com/office/drawing/2014/chartex" xmlns:cx1="http://schemas.microsoft.com/office/drawing/2015/9/8/chartex" xmlns:cx2="http://schemas.microsoft.com/office/drawing/2015/10/21/chartex" xmlns:cx3="http://schemas.microsoft.com/office/drawing/2016/5/9/chartex" xmlns:cx4="http://schemas.microsoft.com/office/drawing/2016/5/10/chartex" xmlns:cx5="http://schemas.microsoft.com/office/drawing/2016/5/11/chartex" xmlns:cx6="http://schemas.microsoft.com/office/drawing/2016/5/12/chartex" xmlns:cx7="http://schemas.microsoft.com/office/drawing/2016/5/13/chartex" xmlns:cx8="http://schemas.microsoft.com/office/drawing/2016/5/14/chartex" xmlns:mc="http://schemas.openxmlformats.org/markup-compatibility/2006" xmlns:aink="http://schemas.microsoft.com/office/drawing/2016/ink" xmlns:am3d="http://schemas.microsoft.com/office/drawing/2017/model3d" xmlns:o="urn:schemas-microsoft-com:office:office" xmlns:oel="http://schemas.microsoft.com/office/2019/extlst" xmlns:r="http://schemas.openxmlformats.org/officeDocument/2006/relationships" xmlns:m="http://schemas.openxmlformats.org/officeDocument/2006/math" xmlns:v="urn:schemas-microsoft-com:vml" xmlns:wp14="http://schemas.microsoft.com/office/word/2010/wordprocessingDrawing" xmlns:wp="http://schemas.openxmlformats.org/drawingml/2006/wordprocessingDrawing" xmlns:w10="urn:schemas-microsoft-com:office:word" xmlns:w="http://schemas.openxmlformats.org/wordprocessingml/2006/main" xmlns:w14="http://schemas.microsoft.com/office/word/2010/wordml" xmlns:w15="http://schemas.microsoft.com/office/word/2012/wordml" xmlns:w16cex="http://schemas.microsoft.com/office/word/2018/wordml/cex" xmlns:w16cid="http://schemas.microsoft.com/office/word/2016/wordml/cid" xmlns:w16="http://schemas.microsoft.com/office/word/2018/wordml" xmlns:w16sdtdh="http://schemas.microsoft.com/office/word/2020/wordml/sdtdatahash" xmlns:w16se="http://schemas.microsoft.com/office/word/2015/wordml/symex" xmlns:wpg="http://schemas.microsoft.com/office/word/2010/wordprocessingGroup" xmlns:wpi="http://schemas.microsoft.com/office/word/2010/wordprocessingInk" xmlns:wne="http://schemas.microsoft.com/office/word/2006/wordml" xmlns:wps="http://schemas.microsoft.com/office/word/2010/wordprocessingShape" mc:Ignorable="w14 w15 w16se w16cid w16 w16cex w16sdtdh wp14">
+  <w:endnote w:type="separator" w:id="-1">
+    <w:p>
+      <w:pPr>
+        <w:spacing w:after="0" w:line="240" w:lineRule="auto"/>
+      </w:pPr>
+      <w:r>
+        <w:separator/>
+      </w:r>
+    </w:p>
+  </w:endnote>
+  <w:endnote w:type="continuationSeparator" w:id="0">
+    <w:p>
+      <w:pPr>
+        <w:spacing w:after="0" w:line="240" w:lineRule="auto"/>
+      </w:pPr>
+      <w:r>
+        <w:continuationSeparator/>
+      </w:r>
+    </w:p>
+  </w:endnote>
+</w:endnotes>
+</file>
+
+<file path=word/footnotes.xml><?xml version="1.0" encoding="utf-8"?>
+<w:footnotes xmlns:wpc="http://schemas.microsoft.com/office/word/2010/wordprocessingCanvas" xmlns:cx="http://schemas.microsoft.com/office/drawing/2014/chartex" xmlns:cx1="http://schemas.microsoft.com/office/drawing/2015/9/8/chartex" xmlns:cx2="http://schemas.microsoft.com/office/drawing/2015/10/21/chartex" xmlns:cx3="http://schemas.microsoft.com/office/drawing/2016/5/9/chartex" xmlns:cx4="http://schemas.microsoft.com/office/drawing/2016/5/10/chartex" xmlns:cx5="http://schemas.microsoft.com/office/drawing/2016/5/11/chartex" xmlns:cx6="http://schemas.microsoft.com/office/drawing/2016/5/12/chartex" xmlns:cx7="http://schemas.microsoft.com/office/drawing/2016/5/13/chartex" xmlns:cx8="http://schemas.microsoft.com/office/drawing/2016/5/14/chartex" xmlns:mc="http://schemas.openxmlformats.org/markup-compatibility/2006" xmlns:aink="http://schemas.microsoft.com/office/drawing/2016/ink" xmlns:am3d="http://schemas.microsoft.com/office/drawing/2017/model3d" xmlns:o="urn:schemas-microsoft-com:office:office" xmlns:oel="http://schemas.microsoft.com/office/2019/extlst" xmlns:r="http://schemas.openxmlformats.org/officeDocument/2006/relationships" xmlns:m="http://schemas.openxmlformats.org/officeDocument/2006/math" xmlns:v="urn:schemas-microsoft-com:vml" xmlns:wp14="http://schemas.microsoft.com/office/word/2010/wordprocessingDrawing" xmlns:wp="http://schemas.openxmlformats.org/drawingml/2006/wordprocessingDrawing" xmlns:w10="urn:schemas-microsoft-com:office:word" xmlns:w="http://schemas.openxmlformats.org/wordprocessingml/2006/main" xmlns:w14="http://schemas.microsoft.com/office/word/2010/wordml" xmlns:w15="http://schemas.microsoft.com/office/word/2012/wordml" xmlns:w16cex="http://schemas.microsoft.com/office/word/2018/wordml/cex" xmlns:w16cid="http://schemas.microsoft.com/office/word/2016/wordml/cid" xmlns:w16="http://schemas.microsoft.com/office/word/2018/wordml" xmlns:w16sdtdh="http://schemas.microsoft.com/office/word/2020/wordml/sdtdatahash" xmlns:w16se="http://schemas.microsoft.com/office/word/2015/wordml/symex" xmlns:wpg="http://schemas.microsoft.com/office/word/2010/wordprocessingGroup" xmlns:wpi="http://schemas.microsoft.com/office/word/2010/wordprocessingInk" xmlns:wne="http://schemas.microsoft.com/office/word/2006/wordml" xmlns:wps="http://schemas.microsoft.com/office/word/2010/wordprocessingShape" mc:Ignorable="w14 w15 w16se w16cid w16 w16cex w16sdtdh wp14">
+  <w:footnote w:type="separator" w:id="-1">
+    <w:p>
+      <w:pPr>
+        <w:spacing w:after="0" w:line="240" w:lineRule="auto"/>
+      </w:pPr>
+      <w:r>
+        <w:separator/>
+      </w:r>
+    </w:p>
+  </w:footnote>
+  <w:footnote w:type="continuationSeparator" w:id="0">
+    <w:p>
+      <w:pPr>
+        <w:spacing w:after="0" w:line="240" w:lineRule="auto"/>
+      </w:pPr>
+      <w:r>
+        <w:continuationSeparator/>
+      </w:r>
+    </w:p>
+  </w:footnote>
+</w:footnotes>
+</file>
+
+<file path=word/header1.xml><?xml version="1.0" encoding="utf-8"?>
+<w:hdr xmlns:wpc="http://schemas.microsoft.com/office/word/2010/wordprocessingCanvas" xmlns:cx="http://schemas.microsoft.com/office/drawing/2014/chartex" xmlns:cx1="http://schemas.microsoft.com/office/drawing/2015/9/8/chartex" xmlns:cx2="http://schemas.microsoft.com/office/drawing/2015/10/21/chartex" xmlns:cx3="http://schemas.microsoft.com/office/drawing/2016/5/9/chartex" xmlns:cx4="http://schemas.microsoft.com/office/drawing/2016/5/10/chartex" xmlns:cx5="http://schemas.microsoft.com/office/drawing/2016/5/11/chartex" xmlns:cx6="http://schemas.microsoft.com/office/drawing/2016/5/12/chartex" xmlns:cx7="http://schemas.microsoft.com/office/drawing/2016/5/13/chartex" xmlns:cx8="http://schemas.microsoft.com/office/drawing/2016/5/14/chartex" xmlns:mc="http://schemas.openxmlformats.org/markup-compatibility/2006" xmlns:aink="http://schemas.microsoft.com/office/drawing/2016/ink" xmlns:am3d="http://schemas.microsoft.com/office/drawing/2017/model3d" xmlns:o="urn:schemas-microsoft-com:office:office" xmlns:oel="http://schemas.microsoft.com/office/2019/extlst" xmlns:r="http://schemas.openxmlformats.org/officeDocument/2006/relationships" xmlns:m="http://schemas.openxmlformats.org/officeDocument/2006/math" xmlns:v="urn:schemas-microsoft-com:vml" xmlns:wp14="http://schemas.microsoft.com/office/word/2010/wordprocessingDrawing" xmlns:wp="http://schemas.openxmlformats.org/drawingml/2006/wordprocessingDrawing" xmlns:w10="urn:schemas-microsoft-com:office:word" xmlns:w="http://schemas.openxmlformats.org/wordprocessingml/2006/main" xmlns:w14="http://schemas.microsoft.com/office/word/2010/wordml" xmlns:w15="http://schemas.microsoft.com/office/word/2012/wordml" xmlns:w16cex="http://schemas.microsoft.com/office/word/2018/wordml/cex" xmlns:w16cid="http://schemas.microsoft.com/office/word/2016/wordml/cid" xmlns:w16="http://schemas.microsoft.com/office/word/2018/wordml" xmlns:w16sdtdh="http://schemas.microsoft.com/office/word/2020/wordml/sdtdatahash" xmlns:w16se="http://schemas.microsoft.com/office/word/2015/wordml/symex" xmlns:wpg="http://schemas.microsoft.com/office/word/2010/wordprocessingGroup" xmlns:wpi="http://schemas.microsoft.com/office/word/2010/wordprocessingInk" xmlns:wne="http://schemas.microsoft.com/office/word/2006/wordml" xmlns:wps="http://schemas.microsoft.com/office/word/2010/wordprocessingShape" mc:Ignorable="w14 w15 w16se w16cid w16 w16cex w16sdtdh wp14">
+  <w:p>
+    <w:pPr>
+      <w:pStyle w:val="Encabezado"/>
+      <w:ind w:left="-142"/>
+    </w:pPr>
+    <w:r>
+      <w:t>Informe de colecciones biológicas y bases de datos de biodiversidad de España. 2026. GBIF.es</w:t>
+    </w:r>
+  </w:p>
+</w:hdr>
 </file>
 
 <file path=word/styles.xml><?xml version="1.0" encoding="utf-8"?>
@@ -1337,6 +1615,206 @@
       </w:tblBorders>
     </w:tblPr>
   </w:style>
+  <w:style w:type="paragraph" w:styleId="Encabezado">
+    <w:name w:val="header"/>
+    <w:basedOn w:val="Normal"/>
+    <w:link w:val="EncabezadoCar"/>
+    <w:uiPriority w:val="99"/>
+    <w:unhideWhenUsed/>
+    <w:rsid w:val="00DD1BAB"/>
+    <w:pPr>
+      <w:tabs>
+        <w:tab w:val="center" w:pos="4513"/>
+        <w:tab w:val="right" w:pos="9026"/>
+      </w:tabs>
+      <w:spacing w:after="0" w:line="240" w:lineRule="auto"/>
+    </w:pPr>
+  </w:style>
+  <w:style w:type="character" w:customStyle="1" w:styleId="EncabezadoCar">
+    <w:name w:val="Encabezado Car"/>
+    <w:basedOn w:val="Fuentedeprrafopredeter"/>
+    <w:link w:val="Encabezado"/>
+    <w:uiPriority w:val="99"/>
+    <w:rsid w:val="00DD1BAB"/>
+  </w:style>
+  <w:style w:type="paragraph" w:styleId="Piedepgina">
+    <w:name w:val="footer"/>
+    <w:basedOn w:val="Normal"/>
+    <w:link w:val="PiedepginaCar"/>
+    <w:uiPriority w:val="99"/>
+    <w:unhideWhenUsed/>
+    <w:rsid w:val="00DD1BAB"/>
+    <w:pPr>
+      <w:tabs>
+        <w:tab w:val="center" w:pos="4513"/>
+        <w:tab w:val="right" w:pos="9026"/>
+      </w:tabs>
+      <w:spacing w:after="0" w:line="240" w:lineRule="auto"/>
+    </w:pPr>
+  </w:style>
+  <w:style w:type="character" w:customStyle="1" w:styleId="PiedepginaCar">
+    <w:name w:val="Pie de página Car"/>
+    <w:basedOn w:val="Fuentedeprrafopredeter"/>
+    <w:link w:val="Piedepgina"/>
+    <w:uiPriority w:val="99"/>
+    <w:rsid w:val="00DD1BAB"/>
+  </w:style>
+  <w:style w:type="table" w:styleId="Tablanormal3">
+    <w:name w:val="Plain Table 3"/>
+    <w:basedOn w:val="Tablanormal"/>
+    <w:uiPriority w:val="43"/>
+    <w:rsid w:val="00A94B9A"/>
+    <w:pPr>
+      <w:spacing w:after="0" w:line="240" w:lineRule="auto"/>
+    </w:pPr>
+    <w:tblPr>
+      <w:tblStyleRowBandSize w:val="1"/>
+      <w:tblStyleColBandSize w:val="1"/>
+    </w:tblPr>
+    <w:tblStylePr w:type="firstRow">
+      <w:rPr>
+        <w:b/>
+        <w:bCs/>
+        <w:caps/>
+      </w:rPr>
+      <w:tblPr/>
+      <w:tcPr>
+        <w:tcBorders>
+          <w:bottom w:val="single" w:sz="4" w:space="0" w:color="7F7F7F" w:themeColor="text1" w:themeTint="80"/>
+        </w:tcBorders>
+      </w:tcPr>
+    </w:tblStylePr>
+    <w:tblStylePr w:type="lastRow">
+      <w:rPr>
+        <w:b/>
+        <w:bCs/>
+        <w:caps/>
+      </w:rPr>
+      <w:tblPr/>
+      <w:tcPr>
+        <w:tcBorders>
+          <w:top w:val="nil"/>
+        </w:tcBorders>
+      </w:tcPr>
+    </w:tblStylePr>
+    <w:tblStylePr w:type="firstCol">
+      <w:rPr>
+        <w:b/>
+        <w:bCs/>
+        <w:caps/>
+      </w:rPr>
+      <w:tblPr/>
+      <w:tcPr>
+        <w:tcBorders>
+          <w:right w:val="single" w:sz="4" w:space="0" w:color="7F7F7F" w:themeColor="text1" w:themeTint="80"/>
+        </w:tcBorders>
+      </w:tcPr>
+    </w:tblStylePr>
+    <w:tblStylePr w:type="lastCol">
+      <w:rPr>
+        <w:b/>
+        <w:bCs/>
+        <w:caps/>
+      </w:rPr>
+      <w:tblPr/>
+      <w:tcPr>
+        <w:tcBorders>
+          <w:left w:val="nil"/>
+        </w:tcBorders>
+      </w:tcPr>
+    </w:tblStylePr>
+    <w:tblStylePr w:type="band1Vert">
+      <w:tblPr/>
+      <w:tcPr>
+        <w:shd w:val="clear" w:color="auto" w:fill="F2F2F2" w:themeFill="background1" w:themeFillShade="F2"/>
+      </w:tcPr>
+    </w:tblStylePr>
+    <w:tblStylePr w:type="band1Horz">
+      <w:tblPr/>
+      <w:tcPr>
+        <w:shd w:val="clear" w:color="auto" w:fill="F2F2F2" w:themeFill="background1" w:themeFillShade="F2"/>
+      </w:tcPr>
+    </w:tblStylePr>
+    <w:tblStylePr w:type="neCell">
+      <w:tblPr/>
+      <w:tcPr>
+        <w:tcBorders>
+          <w:left w:val="nil"/>
+        </w:tcBorders>
+      </w:tcPr>
+    </w:tblStylePr>
+    <w:tblStylePr w:type="nwCell">
+      <w:tblPr/>
+      <w:tcPr>
+        <w:tcBorders>
+          <w:right w:val="nil"/>
+        </w:tcBorders>
+      </w:tcPr>
+    </w:tblStylePr>
+  </w:style>
+  <w:style w:type="table" w:styleId="Tablanormal1">
+    <w:name w:val="Plain Table 1"/>
+    <w:basedOn w:val="Tablanormal"/>
+    <w:uiPriority w:val="41"/>
+    <w:rsid w:val="00A94B9A"/>
+    <w:pPr>
+      <w:spacing w:after="0" w:line="240" w:lineRule="auto"/>
+    </w:pPr>
+    <w:tblPr>
+      <w:tblStyleRowBandSize w:val="1"/>
+      <w:tblStyleColBandSize w:val="1"/>
+      <w:tblBorders>
+        <w:top w:val="single" w:sz="4" w:space="0" w:color="BFBFBF" w:themeColor="background1" w:themeShade="BF"/>
+        <w:left w:val="single" w:sz="4" w:space="0" w:color="BFBFBF" w:themeColor="background1" w:themeShade="BF"/>
+        <w:bottom w:val="single" w:sz="4" w:space="0" w:color="BFBFBF" w:themeColor="background1" w:themeShade="BF"/>
+        <w:right w:val="single" w:sz="4" w:space="0" w:color="BFBFBF" w:themeColor="background1" w:themeShade="BF"/>
+        <w:insideH w:val="single" w:sz="4" w:space="0" w:color="BFBFBF" w:themeColor="background1" w:themeShade="BF"/>
+        <w:insideV w:val="single" w:sz="4" w:space="0" w:color="BFBFBF" w:themeColor="background1" w:themeShade="BF"/>
+      </w:tblBorders>
+    </w:tblPr>
+    <w:tblStylePr w:type="firstRow">
+      <w:rPr>
+        <w:b/>
+        <w:bCs/>
+      </w:rPr>
+    </w:tblStylePr>
+    <w:tblStylePr w:type="lastRow">
+      <w:rPr>
+        <w:b/>
+        <w:bCs/>
+      </w:rPr>
+      <w:tblPr/>
+      <w:tcPr>
+        <w:tcBorders>
+          <w:top w:val="double" w:sz="4" w:space="0" w:color="BFBFBF" w:themeColor="background1" w:themeShade="BF"/>
+        </w:tcBorders>
+      </w:tcPr>
+    </w:tblStylePr>
+    <w:tblStylePr w:type="firstCol">
+      <w:rPr>
+        <w:b/>
+        <w:bCs/>
+      </w:rPr>
+    </w:tblStylePr>
+    <w:tblStylePr w:type="lastCol">
+      <w:rPr>
+        <w:b/>
+        <w:bCs/>
+      </w:rPr>
+    </w:tblStylePr>
+    <w:tblStylePr w:type="band1Vert">
+      <w:tblPr/>
+      <w:tcPr>
+        <w:shd w:val="clear" w:color="auto" w:fill="F2F2F2" w:themeFill="background1" w:themeFillShade="F2"/>
+      </w:tcPr>
+    </w:tblStylePr>
+    <w:tblStylePr w:type="band1Horz">
+      <w:tblPr/>
+      <w:tcPr>
+        <w:shd w:val="clear" w:color="auto" w:fill="F2F2F2" w:themeFill="background1" w:themeFillShade="F2"/>
+      </w:tcPr>
+    </w:tblStylePr>
+  </w:style>
 </w:styles>
 </file>
 

</xml_diff>

<commit_message>
feat(sql): añadir scripts sql de vistas y procedimientos y actualizar ultima version del informe
</commit_message>
<xml_diff>
--- a/inst/reports/assets/portada/tablas_versiones.docx
+++ b/inst/reports/assets/portada/tablas_versiones.docx
@@ -119,7 +119,13 @@
               <w:cnfStyle w:val="000000100000" w:firstRow="0" w:lastRow="0" w:firstColumn="0" w:lastColumn="0" w:oddVBand="0" w:evenVBand="0" w:oddHBand="1" w:evenHBand="0" w:firstRowFirstColumn="0" w:firstRowLastColumn="0" w:lastRowFirstColumn="0" w:lastRowLastColumn="0"/>
             </w:pPr>
             <w:r>
-              <w:t>Marzo 2026</w:t>
+              <w:t>M</w:t>
+            </w:r>
+            <w:r>
+              <w:t>ay</w:t>
+            </w:r>
+            <w:r>
+              <w:t>o 2026</w:t>
             </w:r>
           </w:p>
         </w:tc>
@@ -603,6 +609,131 @@
     </w:tbl>
     <w:p/>
     <w:p/>
+    <w:p/>
+    <w:p/>
+    <w:p/>
+    <w:p>
+      <w:pPr>
+        <w:rPr>
+          <w:b/>
+          <w:bCs/>
+          <w:i/>
+          <w:iCs/>
+        </w:rPr>
+      </w:pPr>
+      <w:r>
+        <w:rPr>
+          <w:b/>
+          <w:bCs/>
+          <w:i/>
+          <w:iCs/>
+        </w:rPr>
+        <w:t>Cita recomendada para esta versión</w:t>
+      </w:r>
+      <w:r>
+        <w:rPr>
+          <w:b/>
+          <w:bCs/>
+          <w:i/>
+          <w:iCs/>
+        </w:rPr>
+        <w:t>:</w:t>
+      </w:r>
+    </w:p>
+    <w:p>
+      <w:pPr>
+        <w:rPr>
+          <w:lang w:val="en-US"/>
+        </w:rPr>
+      </w:pPr>
+      <w:r>
+        <w:t xml:space="preserve">Perez </w:t>
+      </w:r>
+      <w:proofErr w:type="spellStart"/>
+      <w:r>
+        <w:t>Perez</w:t>
+      </w:r>
+      <w:proofErr w:type="spellEnd"/>
+      <w:r>
+        <w:t xml:space="preserve">, R., </w:t>
+      </w:r>
+      <w:proofErr w:type="spellStart"/>
+      <w:r>
+        <w:t>Cezón</w:t>
+      </w:r>
+      <w:proofErr w:type="spellEnd"/>
+      <w:r>
+        <w:t xml:space="preserve">, K., Lujano, C., &amp; Pando, F. (2026). Informe de colecciones biológicas y bases de datos de biodiversidad </w:t>
+      </w:r>
+      <w:r>
+        <w:t xml:space="preserve">en </w:t>
+      </w:r>
+      <w:r>
+        <w:t>España</w:t>
+      </w:r>
+      <w:r>
+        <w:t>, 7ª ed.</w:t>
+      </w:r>
+      <w:r>
+        <w:t xml:space="preserve"> </w:t>
+      </w:r>
+      <w:proofErr w:type="spellStart"/>
+      <w:r>
+        <w:rPr>
+          <w:lang w:val="en-US"/>
+        </w:rPr>
+        <w:t>Nodo</w:t>
+      </w:r>
+      <w:proofErr w:type="spellEnd"/>
+      <w:r>
+        <w:rPr>
+          <w:lang w:val="en-US"/>
+        </w:rPr>
+        <w:t xml:space="preserve"> Nacional de </w:t>
+      </w:r>
+      <w:proofErr w:type="spellStart"/>
+      <w:r>
+        <w:rPr>
+          <w:lang w:val="en-US"/>
+        </w:rPr>
+        <w:t>Información</w:t>
+      </w:r>
+      <w:proofErr w:type="spellEnd"/>
+      <w:r>
+        <w:rPr>
+          <w:lang w:val="en-US"/>
+        </w:rPr>
+        <w:t xml:space="preserve"> </w:t>
+      </w:r>
+      <w:proofErr w:type="spellStart"/>
+      <w:r>
+        <w:rPr>
+          <w:lang w:val="en-US"/>
+        </w:rPr>
+        <w:t>en</w:t>
+      </w:r>
+      <w:proofErr w:type="spellEnd"/>
+      <w:r>
+        <w:rPr>
+          <w:lang w:val="en-US"/>
+        </w:rPr>
+        <w:t xml:space="preserve"> </w:t>
+      </w:r>
+      <w:proofErr w:type="spellStart"/>
+      <w:r>
+        <w:rPr>
+          <w:lang w:val="en-US"/>
+        </w:rPr>
+        <w:t>Biodiversidad</w:t>
+      </w:r>
+      <w:proofErr w:type="spellEnd"/>
+      <w:r>
+        <w:rPr>
+          <w:lang w:val="en-US"/>
+        </w:rPr>
+        <w:t xml:space="preserve"> GBIF-CSIC. Retrieved from https://doi.org/10.20350/digitalCSIC/18373</w:t>
+      </w:r>
+    </w:p>
     <w:sectPr>
       <w:headerReference w:type="default" r:id="rId6"/>
       <w:pgSz w:w="11906" w:h="16838"/>
@@ -672,7 +803,13 @@
       <w:ind w:left="-142"/>
     </w:pPr>
     <w:r>
-      <w:t>Informe de colecciones biológicas y bases de datos de biodiversidad de España. 2026. GBIF.es</w:t>
+      <w:t xml:space="preserve">Informe de colecciones biológicas y bases de datos de biodiversidad </w:t>
+    </w:r>
+    <w:r>
+      <w:t>en</w:t>
+    </w:r>
+    <w:r>
+      <w:t xml:space="preserve"> España. 2026. GBIF.es</w:t>
     </w:r>
   </w:p>
 </w:hdr>

</xml_diff>